<commit_message>
Updated the experiences section and deleted site2
</commit_message>
<xml_diff>
--- a/website-plan.docx
+++ b/website-plan.docx
@@ -28,10 +28,10 @@
     <w:p>
       <w:r>
         <w:drawing>
-          <wp:inline distT="0" distB="0" distL="0" distR="0" wp14:anchorId="4D93B452" wp14:editId="1F7E2221">
+          <wp:inline distT="0" distB="0" distL="0" distR="0" wp14:anchorId="58F07C35" wp14:editId="691F7AE1">
             <wp:extent cx="5730240" cy="3154680"/>
             <wp:effectExtent l="0" t="0" r="3810" b="7620"/>
-            <wp:docPr id="1323203948" name="Picture 2"/>
+            <wp:docPr id="1827501127" name="Picture 2"/>
             <wp:cNvGraphicFramePr>
               <a:graphicFrameLocks xmlns:a="http://schemas.openxmlformats.org/drawingml/2006/main" noChangeAspect="1"/>
             </wp:cNvGraphicFramePr>

</xml_diff>